<commit_message>
Cho phep phu huynh/can bo bo qua doi mat khau lan dau (nut "De sau")
- Man dat mat khau lan dau co nut "De sau, vao xem truoc"; trong phien do web khong ep nua
- Menu van co nhan "nen doi", lan dang nhap sau web nhac lai cho den khi doi
- Cap nhat tai lieu

Co-Authored-By: Claude Sonnet 5.5 <noreply@anthropic.com>
</commit_message>
<xml_diff>
--- a/tai-lieu/MO-TA-CHUC-NANG-CHI-TIET.docx
+++ b/tai-lieu/MO-TA-CHUC-NANG-CHI-TIET.docx
@@ -811,7 +811,7 @@
         <w:rPr>
           <w:rFonts w:ascii="Times New Roman" w:cs="Times New Roman" w:eastAsia="Times New Roman" w:hAnsi="Times New Roman"/>
         </w:rPr>
-        <w:t xml:space="preserve">2.2. Đổi mật khẩu lần đầu (bắt buộc với tài khoản mới)</w:t>
+        <w:t xml:space="preserve">2.2. Đổi mật khẩu lần đầu (nên làm, có thể để sau)</w:t>
       </w:r>
     </w:p>
     <w:p>
@@ -824,7 +824,7 @@
           <w:sz w:val="26"/>
           <w:szCs w:val="26"/>
         </w:rPr>
-        <w:t xml:space="preserve">Tài khoản vừa được cấp (hoặc vừa được GVCN đặt lại mật khẩu có tích “bắt đổi”) sẽ bị chuyển thẳng tới màn hình đặt mật khẩu riêng; chưa đổi thì chưa vào được chức năng khác.</w:t>
+        <w:t xml:space="preserve">Tài khoản vừa được cấp (hoặc vừa được GVCN đặt lại mật khẩu có tích “bắt đổi”) sẽ được chuyển tới màn hình đặt mật khẩu riêng. Nếu chưa muốn đổi ngay, bấm “Để sau, vào xem trước” để vào dùng bình thường; mục “Đổi mật khẩu” trong menu góc phải trên vẫn có nhãn “nên đổi” và đổi được lúc nào cũng được. Lần đăng nhập sau web sẽ nhắc lại cho đến khi đổi.</w:t>
       </w:r>
     </w:p>
     <w:p>

</xml_diff>